<commit_message>
Continue with lesson 29
</commit_message>
<xml_diff>
--- a/Lessons/Course notes going forward.docx
+++ b/Lessons/Course notes going forward.docx
@@ -19,82 +19,6 @@
         </w:rPr>
         <w:t xml:space="preserve"> </w:t>
       </w:r>
-      <w:r>
-        <w:rPr>
-          <w:sz w:val="26"/>
-          <w:szCs w:val="26"/>
-        </w:rPr>
-        <w:t xml:space="preserve">The data logging methods </w:t>
-      </w:r>
-      <w:r>
-        <w:rPr>
-          <w:sz w:val="26"/>
-          <w:szCs w:val="26"/>
-        </w:rPr>
-        <w:t>are in the DataLogUtil utility class.</w:t>
-      </w:r>
-    </w:p>
-    <w:p>
-      <w:pPr>
-        <w:pStyle w:val="normal1"/>
-        <w:rPr>
-          <w:sz w:val="26"/>
-          <w:szCs w:val="26"/>
-        </w:rPr>
-      </w:pPr>
-      <w:r>
-        <w:rPr>
-          <w:sz w:val="26"/>
-          <w:szCs w:val="26"/>
-        </w:rPr>
-      </w:r>
-    </w:p>
-    <w:p>
-      <w:pPr>
-        <w:pStyle w:val="normal1"/>
-        <w:rPr>
-          <w:sz w:val="26"/>
-          <w:szCs w:val="26"/>
-        </w:rPr>
-      </w:pPr>
-      <w:r>
-        <w:rPr>
-          <w:sz w:val="26"/>
-          <w:szCs w:val="26"/>
-        </w:rPr>
-        <w:t>When we want to add to the log file we will most often use the writeMessage method or the writeMessageEcho method.  Both of these append data to the open log file with the latter also sending the data to the Terminal.  Run the autonomous DriveTime routine to see this work.</w:t>
-      </w:r>
-    </w:p>
-    <w:p>
-      <w:pPr>
-        <w:pStyle w:val="normal1"/>
-        <w:rPr>
-          <w:sz w:val="26"/>
-          <w:szCs w:val="26"/>
-        </w:rPr>
-      </w:pPr>
-      <w:r>
-        <w:rPr>
-          <w:sz w:val="26"/>
-          <w:szCs w:val="26"/>
-        </w:rPr>
-        <w:t>The logging call is:</w:t>
-      </w:r>
-    </w:p>
-    <w:p>
-      <w:pPr>
-        <w:pStyle w:val="normal1"/>
-        <w:rPr>
-          <w:sz w:val="26"/>
-          <w:szCs w:val="26"/>
-        </w:rPr>
-      </w:pPr>
-      <w:r>
-        <w:rPr>
-          <w:sz w:val="26"/>
-          <w:szCs w:val="26"/>
-        </w:rPr>
-      </w:r>
     </w:p>
     <w:p>
       <w:pPr>
@@ -108,69 +32,9 @@
       </w:pPr>
       <w:r>
         <w:rPr>
-          <w:rFonts w:ascii="Consolas;Courier New;monospace" w:hAnsi="Consolas;Courier New;monospace"/>
-          <w:b w:val="false"/>
-          <w:color w:val="4EC9B0"/>
-          <w:sz w:val="21"/>
-          <w:szCs w:val="26"/>
-          <w:shd w:fill="1F1F1F" w:val="clear"/>
-        </w:rPr>
-        <w:t>DataLogUtil</w:t>
-      </w:r>
-      <w:r>
-        <w:rPr>
-          <w:rFonts w:ascii="Consolas;Courier New;monospace" w:hAnsi="Consolas;Courier New;monospace"/>
-          <w:b w:val="false"/>
-          <w:color w:val="CCCCCC"/>
-          <w:sz w:val="21"/>
-          <w:szCs w:val="26"/>
-          <w:shd w:fill="1F1F1F" w:val="clear"/>
-        </w:rPr>
-        <w:t>.</w:t>
-      </w:r>
-      <w:r>
-        <w:rPr>
-          <w:rFonts w:ascii="Consolas;Courier New;monospace" w:hAnsi="Consolas;Courier New;monospace"/>
-          <w:b w:val="false"/>
-          <w:color w:val="DCDCAA"/>
-          <w:sz w:val="21"/>
-          <w:szCs w:val="26"/>
-          <w:shd w:fill="1F1F1F" w:val="clear"/>
-        </w:rPr>
-        <w:t>writeMessageEcho</w:t>
-      </w:r>
-      <w:r>
-        <w:rPr>
-          <w:rFonts w:ascii="Consolas;Courier New;monospace" w:hAnsi="Consolas;Courier New;monospace"/>
-          <w:b w:val="false"/>
-          <w:color w:val="CCCCCC"/>
-          <w:sz w:val="21"/>
-          <w:szCs w:val="26"/>
-          <w:shd w:fill="1F1F1F" w:val="clear"/>
-        </w:rPr>
-        <w:t>(</w:t>
-      </w:r>
-      <w:r>
-        <w:rPr>
-          <w:rFonts w:ascii="Consolas;Courier New;monospace" w:hAnsi="Consolas;Courier New;monospace"/>
-          <w:b w:val="false"/>
-          <w:color w:val="CE9178"/>
-          <w:sz w:val="21"/>
-          <w:szCs w:val="26"/>
-          <w:shd w:fill="1F1F1F" w:val="clear"/>
-        </w:rPr>
-        <w:t>"DriveTime init "</w:t>
-      </w:r>
-      <w:r>
-        <w:rPr>
-          <w:rFonts w:ascii="Consolas;Courier New;monospace" w:hAnsi="Consolas;Courier New;monospace"/>
-          <w:b w:val="false"/>
-          <w:color w:val="CCCCCC"/>
-          <w:sz w:val="21"/>
-          <w:szCs w:val="26"/>
-          <w:shd w:fill="1F1F1F" w:val="clear"/>
-        </w:rPr>
-        <w:t>);</w:t>
+          <w:sz w:val="26"/>
+          <w:szCs w:val="26"/>
+        </w:rPr>
       </w:r>
     </w:p>
     <w:p>
@@ -185,12 +49,8 @@
       </w:pPr>
       <w:r>
         <w:rPr>
-          <w:rFonts w:ascii="Consolas;Courier New;monospace" w:hAnsi="Consolas;Courier New;monospace"/>
-          <w:b w:val="false"/>
-          <w:color w:val="CCCCCC"/>
-          <w:sz w:val="21"/>
-          <w:szCs w:val="26"/>
-          <w:shd w:fill="1F1F1F" w:val="clear"/>
+          <w:sz w:val="26"/>
+          <w:szCs w:val="26"/>
         </w:rPr>
       </w:r>
     </w:p>
@@ -206,12 +66,8 @@
       </w:pPr>
       <w:r>
         <w:rPr>
-          <w:rFonts w:ascii="Consolas;Courier New;monospace" w:hAnsi="Consolas;Courier New;monospace"/>
-          <w:b w:val="false"/>
-          <w:color w:val="CCCCCC"/>
-          <w:sz w:val="21"/>
-          <w:szCs w:val="26"/>
-          <w:shd w:fill="1F1F1F" w:val="clear"/>
+          <w:sz w:val="26"/>
+          <w:szCs w:val="26"/>
         </w:rPr>
       </w:r>
     </w:p>
@@ -227,33 +83,8 @@
       </w:pPr>
       <w:r>
         <w:rPr>
-          <w:rFonts w:ascii="Consolas;Courier New;monospace" w:hAnsi="Consolas;Courier New;monospace"/>
-          <w:b w:val="false"/>
-          <w:color w:val="CCCCCC"/>
-          <w:sz w:val="21"/>
-          <w:szCs w:val="26"/>
-          <w:shd w:fill="1F1F1F" w:val="clear"/>
-        </w:rPr>
-      </w:r>
-    </w:p>
-    <w:p>
-      <w:pPr>
-        <w:pStyle w:val="Normal"/>
-        <w:bidi w:val="0"/>
-        <w:jc w:val="left"/>
-        <w:rPr>
-          <w:sz w:val="26"/>
-          <w:szCs w:val="26"/>
-        </w:rPr>
-      </w:pPr>
-      <w:r>
-        <w:rPr>
-          <w:rFonts w:ascii="Consolas;Courier New;monospace" w:hAnsi="Consolas;Courier New;monospace"/>
-          <w:b w:val="false"/>
-          <w:color w:val="CCCCCC"/>
-          <w:sz w:val="21"/>
-          <w:szCs w:val="26"/>
-          <w:shd w:fill="1F1F1F" w:val="clear"/>
+          <w:sz w:val="26"/>
+          <w:szCs w:val="26"/>
         </w:rPr>
       </w:r>
     </w:p>
@@ -362,7 +193,6 @@
       </w:pPr>
       <w:r>
         <w:rPr>
-          <w:color w:val="069A2E"/>
           <w:sz w:val="26"/>
           <w:szCs w:val="26"/>
         </w:rPr>
@@ -395,7 +225,6 @@
       </w:pPr>
       <w:r>
         <w:rPr>
-          <w:color w:val="000000"/>
           <w:sz w:val="26"/>
           <w:szCs w:val="26"/>
         </w:rPr>
@@ -527,6 +356,7 @@
       <w:pgNumType w:fmt="decimal"/>
       <w:formProt w:val="false"/>
       <w:textDirection w:val="lrTb"/>
+      <w:docGrid w:type="default" w:linePitch="100" w:charSpace="0"/>
     </w:sectPr>
   </w:body>
 </w:document>
@@ -546,7 +376,6 @@
     </w:rPrDefault>
     <w:pPrDefault>
       <w:pPr>
-        <w:widowControl/>
         <w:suppressAutoHyphens w:val="true"/>
       </w:pPr>
     </w:pPrDefault>
@@ -556,7 +385,10 @@
     <w:qFormat/>
     <w:pPr>
       <w:widowControl/>
+      <w:suppressAutoHyphens w:val="true"/>
       <w:bidi w:val="0"/>
+      <w:spacing w:before="0" w:after="0"/>
+      <w:jc w:val="left"/>
     </w:pPr>
     <w:rPr>
       <w:rFonts w:ascii="Liberation Serif" w:hAnsi="Liberation Serif" w:eastAsia="Noto Serif SC" w:cs="Lucida Sans"/>

</xml_diff>

<commit_message>
Update Course notes going forward.docx
</commit_message>
<xml_diff>
--- a/Lessons/Course notes going forward.docx
+++ b/Lessons/Course notes going forward.docx
@@ -240,7 +240,67 @@
       </w:pPr>
       <w:r>
         <w:rPr>
+          <w:sz w:val="26"/>
+          <w:szCs w:val="26"/>
+        </w:rPr>
+        <w:t xml:space="preserve">Add exercise to add driveTime: </w:t>
+      </w:r>
+      <w:r>
+        <w:rPr>
+          <w:rFonts w:ascii="Arial" w:hAnsi="Arial"/>
+          <w:sz w:val="26"/>
+          <w:szCs w:val="26"/>
+        </w:rPr>
+        <w:t xml:space="preserve"> </w:t>
+      </w:r>
+      <w:bookmarkStart w:id="0" w:name="docs-internal-guid-1605cc32-7fff-f763-f7"/>
+      <w:bookmarkEnd w:id="0"/>
+      <w:r>
+        <w:rPr>
+          <w:rFonts w:eastAsia="Arial" w:cs="Arial" w:ascii="Arial" w:hAnsi="Arial"/>
+          <w:b w:val="false"/>
+          <w:i w:val="false"/>
+          <w:caps w:val="false"/>
+          <w:smallCaps w:val="false"/>
+          <w:strike w:val="false"/>
+          <w:dstrike w:val="false"/>
           <w:color w:val="000000"/>
+          <w:kern w:val="0"/>
+          <w:sz w:val="26"/>
+          <w:szCs w:val="26"/>
+          <w:u w:val="none"/>
+          <w:effect w:val="none"/>
+          <w:shd w:fill="auto" w:val="clear"/>
+        </w:rPr>
+        <w:t>Task:  Add file logging to DriveTime – Initialize, Execute (percent setting and velocity), End</w:t>
+      </w:r>
+    </w:p>
+    <w:p>
+      <w:pPr>
+        <w:pStyle w:val="normal1"/>
+        <w:rPr>
+          <w:sz w:val="26"/>
+          <w:szCs w:val="26"/>
+        </w:rPr>
+      </w:pPr>
+      <w:r>
+        <w:rPr>
+          <w:sz w:val="26"/>
+          <w:szCs w:val="26"/>
+        </w:rPr>
+      </w:r>
+    </w:p>
+    <w:p>
+      <w:pPr>
+        <w:pStyle w:val="normal1"/>
+        <w:rPr>
+          <w:sz w:val="26"/>
+          <w:szCs w:val="26"/>
+        </w:rPr>
+      </w:pPr>
+      <w:r>
+        <w:rPr>
+          <w:color w:val="000000"/>
           <w:sz w:val="26"/>
           <w:szCs w:val="26"/>
         </w:rPr>
@@ -359,87 +419,214 @@
       </w:pPr>
       <w:r>
         <w:rPr>
-          <w:color w:val="000000"/>
-          <w:sz w:val="26"/>
-          <w:szCs w:val="26"/>
-        </w:rPr>
-      </w:r>
-    </w:p>
-    <w:p>
-      <w:pPr>
-        <w:pStyle w:val="normal1"/>
-        <w:rPr>
-          <w:sz w:val="26"/>
-          <w:szCs w:val="26"/>
-        </w:rPr>
-      </w:pPr>
-      <w:r>
-        <w:rPr>
-          <w:color w:val="000000"/>
-          <w:sz w:val="26"/>
-          <w:szCs w:val="26"/>
-        </w:rPr>
-      </w:r>
-    </w:p>
-    <w:p>
-      <w:pPr>
-        <w:pStyle w:val="normal1"/>
-        <w:rPr>
-          <w:sz w:val="26"/>
-          <w:szCs w:val="26"/>
-        </w:rPr>
-      </w:pPr>
-      <w:r>
-        <w:rPr>
-          <w:color w:val="000000"/>
-          <w:sz w:val="26"/>
-          <w:szCs w:val="26"/>
-        </w:rPr>
-      </w:r>
-    </w:p>
-    <w:p>
-      <w:pPr>
-        <w:pStyle w:val="normal1"/>
-        <w:rPr>
-          <w:sz w:val="26"/>
-          <w:szCs w:val="26"/>
-        </w:rPr>
-      </w:pPr>
-      <w:r>
-        <w:rPr>
-          <w:color w:val="000000"/>
-          <w:sz w:val="26"/>
-          <w:szCs w:val="26"/>
-        </w:rPr>
-      </w:r>
-    </w:p>
-    <w:p>
-      <w:pPr>
-        <w:pStyle w:val="normal1"/>
-        <w:rPr>
-          <w:sz w:val="26"/>
-          <w:szCs w:val="26"/>
-        </w:rPr>
-      </w:pPr>
-      <w:r>
-        <w:rPr>
-          <w:color w:val="000000"/>
-          <w:sz w:val="26"/>
-          <w:szCs w:val="26"/>
-        </w:rPr>
-      </w:r>
-    </w:p>
-    <w:p>
-      <w:pPr>
-        <w:pStyle w:val="normal1"/>
-        <w:rPr>
-          <w:sz w:val="26"/>
-          <w:szCs w:val="26"/>
-        </w:rPr>
-      </w:pPr>
-      <w:r>
-        <w:rPr>
-          <w:color w:val="000000"/>
+          <w:sz w:val="26"/>
+          <w:szCs w:val="26"/>
+        </w:rPr>
+      </w:r>
+    </w:p>
+    <w:p>
+      <w:pPr>
+        <w:pStyle w:val="normal1"/>
+        <w:rPr>
+          <w:sz w:val="26"/>
+          <w:szCs w:val="26"/>
+        </w:rPr>
+      </w:pPr>
+      <w:r>
+        <w:rPr>
+          <w:sz w:val="26"/>
+          <w:szCs w:val="26"/>
+        </w:rPr>
+        <w:t>lessons to go:</w:t>
+      </w:r>
+    </w:p>
+    <w:p>
+      <w:pPr>
+        <w:pStyle w:val="normal1"/>
+        <w:rPr>
+          <w:sz w:val="26"/>
+          <w:szCs w:val="26"/>
+        </w:rPr>
+      </w:pPr>
+      <w:r>
+        <w:rPr>
+          <w:sz w:val="26"/>
+          <w:szCs w:val="26"/>
+        </w:rPr>
+      </w:r>
+    </w:p>
+    <w:p>
+      <w:pPr>
+        <w:pStyle w:val="normal1"/>
+        <w:rPr>
+          <w:sz w:val="26"/>
+          <w:szCs w:val="26"/>
+        </w:rPr>
+      </w:pPr>
+      <w:r>
+        <w:rPr>
+          <w:sz w:val="26"/>
+          <w:szCs w:val="26"/>
+        </w:rPr>
+        <w:t>20. Autonomous – routine to drive in a square, discuss DriveTurn</w:t>
+      </w:r>
+    </w:p>
+    <w:p>
+      <w:pPr>
+        <w:pStyle w:val="normal1"/>
+        <w:rPr>
+          <w:sz w:val="26"/>
+          <w:szCs w:val="26"/>
+        </w:rPr>
+      </w:pPr>
+      <w:r>
+        <w:rPr>
+          <w:sz w:val="26"/>
+          <w:szCs w:val="26"/>
+        </w:rPr>
+        <w:t xml:space="preserve">21. Gripper subsystem </w:t>
+      </w:r>
+      <w:r>
+        <w:rPr>
+          <w:sz w:val="26"/>
+          <w:szCs w:val="26"/>
+        </w:rPr>
+        <w:t>close, open,  and autograb routine</w:t>
+      </w:r>
+    </w:p>
+    <w:p>
+      <w:pPr>
+        <w:pStyle w:val="normal1"/>
+        <w:rPr>
+          <w:sz w:val="26"/>
+          <w:szCs w:val="26"/>
+        </w:rPr>
+      </w:pPr>
+      <w:r>
+        <w:rPr>
+          <w:sz w:val="26"/>
+          <w:szCs w:val="26"/>
+        </w:rPr>
+        <w:t>22. Choreo</w:t>
+      </w:r>
+    </w:p>
+    <w:p>
+      <w:pPr>
+        <w:pStyle w:val="normal1"/>
+        <w:rPr>
+          <w:sz w:val="26"/>
+          <w:szCs w:val="26"/>
+        </w:rPr>
+      </w:pPr>
+      <w:r>
+        <w:rPr>
+          <w:sz w:val="26"/>
+          <w:szCs w:val="26"/>
+        </w:rPr>
+        <w:t>23.  water bottle challenge</w:t>
+      </w:r>
+    </w:p>
+    <w:p>
+      <w:pPr>
+        <w:pStyle w:val="normal1"/>
+        <w:rPr>
+          <w:sz w:val="26"/>
+          <w:szCs w:val="26"/>
+        </w:rPr>
+      </w:pPr>
+      <w:r>
+        <w:rPr>
+          <w:sz w:val="26"/>
+          <w:szCs w:val="26"/>
+        </w:rPr>
+        <w:t>Do we do PID and Motion Profiling</w:t>
+      </w:r>
+    </w:p>
+    <w:p>
+      <w:pPr>
+        <w:pStyle w:val="normal1"/>
+        <w:rPr>
+          <w:sz w:val="26"/>
+          <w:szCs w:val="26"/>
+        </w:rPr>
+      </w:pPr>
+      <w:r>
+        <w:rPr>
+          <w:sz w:val="26"/>
+          <w:szCs w:val="26"/>
+        </w:rPr>
+      </w:r>
+    </w:p>
+    <w:p>
+      <w:pPr>
+        <w:pStyle w:val="normal1"/>
+        <w:rPr>
+          <w:sz w:val="26"/>
+          <w:szCs w:val="26"/>
+        </w:rPr>
+      </w:pPr>
+      <w:r>
+        <w:rPr>
+          <w:sz w:val="26"/>
+          <w:szCs w:val="26"/>
+        </w:rPr>
+      </w:r>
+    </w:p>
+    <w:p>
+      <w:pPr>
+        <w:pStyle w:val="normal1"/>
+        <w:rPr>
+          <w:sz w:val="26"/>
+          <w:szCs w:val="26"/>
+        </w:rPr>
+      </w:pPr>
+      <w:r>
+        <w:rPr>
+          <w:sz w:val="26"/>
+          <w:szCs w:val="26"/>
+        </w:rPr>
+      </w:r>
+    </w:p>
+    <w:p>
+      <w:pPr>
+        <w:pStyle w:val="normal1"/>
+        <w:rPr>
+          <w:sz w:val="26"/>
+          <w:szCs w:val="26"/>
+        </w:rPr>
+      </w:pPr>
+      <w:r>
+        <w:rPr>
+          <w:sz w:val="26"/>
+          <w:szCs w:val="26"/>
+        </w:rPr>
+      </w:r>
+    </w:p>
+    <w:p>
+      <w:pPr>
+        <w:pStyle w:val="normal1"/>
+        <w:rPr>
+          <w:sz w:val="26"/>
+          <w:szCs w:val="26"/>
+        </w:rPr>
+      </w:pPr>
+      <w:r>
+        <w:rPr>
+          <w:sz w:val="26"/>
+          <w:szCs w:val="26"/>
+        </w:rPr>
+      </w:r>
+    </w:p>
+    <w:p>
+      <w:pPr>
+        <w:pStyle w:val="normal1"/>
+        <w:rPr>
+          <w:sz w:val="26"/>
+          <w:szCs w:val="26"/>
+        </w:rPr>
+      </w:pPr>
+      <w:r>
+        <w:rPr>
           <w:sz w:val="26"/>
           <w:szCs w:val="26"/>
         </w:rPr>
@@ -507,18 +694,25 @@
     <w:qFormat/>
     <w:rPr/>
   </w:style>
+  <w:style w:type="character" w:styleId="Bulletsuser">
+    <w:name w:val="Bullets (user)"/>
+    <w:qFormat/>
+    <w:rPr>
+      <w:rFonts w:ascii="OpenSymbol" w:hAnsi="OpenSymbol" w:eastAsia="OpenSymbol" w:cs="OpenSymbol"/>
+    </w:rPr>
+  </w:style>
+  <w:style w:type="character" w:styleId="FollowedHyperlink">
+    <w:name w:val="FollowedHyperlink"/>
+    <w:rPr>
+      <w:color w:val="800000"/>
+      <w:u w:val="single"/>
+    </w:rPr>
+  </w:style>
   <w:style w:type="character" w:styleId="Bullets">
     <w:name w:val="Bullets"/>
     <w:qFormat/>
     <w:rPr>
       <w:rFonts w:ascii="OpenSymbol" w:hAnsi="OpenSymbol" w:eastAsia="OpenSymbol" w:cs="OpenSymbol"/>
-    </w:rPr>
-  </w:style>
-  <w:style w:type="character" w:styleId="FollowedHyperlink">
-    <w:name w:val="FollowedHyperlink"/>
-    <w:rPr>
-      <w:color w:val="800000"/>
-      <w:u w:val="single"/>
     </w:rPr>
   </w:style>
   <w:style w:type="paragraph" w:styleId="Heading">

</xml_diff>